<commit_message>
Add swipe-to-connect discovery deck and profile photo upload
- New SwipeDeck component (Reanimated + Gesture Handler), replaces
  the Discover FlatList with a swipeable card stack
- Photo upload on Profile screen via expo-image-picker + Supabase
  Storage (avatars bucket)
- Schema: connection_status gains 'passed'; suggested_matches now
  excludes any existing connection, not just blocked; interests
  table RLS read policy added
- 5 new pgTAP tests (40 -> 45) covering the above
- Translations for swipe/photo strings across en/fr/es/ar
- README and overview doc updated to reflect the new features
</commit_message>
<xml_diff>
--- a/ConferenceMeet-Overview.docx
+++ b/ConferenceMeet-Overview.docx
@@ -187,7 +187,7 @@
         <w:t xml:space="preserve">Build a profile — </w:t>
       </w:r>
       <w:r>
-        <w:t xml:space="preserve">name, role, organization, a short bio, their interests, and — importantly — a line about what they hope to get from the event.</w:t>
+        <w:t xml:space="preserve">name, role, organization, a profile photo, a short bio, their interests, and — importantly — a line about what they hope to get from the event.</w:t>
       </w:r>
     </w:p>
     <w:p>
@@ -233,7 +233,7 @@
         <w:t xml:space="preserve">See suggested people — </w:t>
       </w:r>
       <w:r>
-        <w:t xml:space="preserve">the app recommends who to meet, based on shared interests and complementary goals, and shows the reason for each suggestion.</w:t>
+        <w:t xml:space="preserve">the app recommends who to meet, based on shared interests and complementary goals, and shows the reason for each suggestion — swipe or tap through them one at a time, saying “I'd like to meet” or “not this time” for each.</w:t>
       </w:r>
     </w:p>
     <w:p>
@@ -385,6 +385,26 @@
     </w:p>
     <w:p>
       <w:pPr>
+        <w:pStyle w:val="ListParagraph"/>
+        <w:numPr>
+          <w:ilvl w:val="0"/>
+          <w:numId w:val="2"/>
+        </w:numPr>
+        <w:spacing w:after="60"/>
+      </w:pPr>
+      <w:r>
+        <w:rPr>
+          <w:b/>
+          <w:bCs/>
+        </w:rPr>
+        <w:t xml:space="preserve">Swipe to connect</w:t>
+      </w:r>
+      <w:r>
+        <w:t xml:space="preserve"> — browse suggested people one at a time in a simple swipe deck, a familiar gesture borrowed from dating apps but used here for professional connections: swipe left (or tap the heart) for “I'd like to meet,” swipe right (or tap the X) to pass. Once you've decided on someone, they won't be suggested again.</w:t>
+      </w:r>
+    </w:p>
+    <w:p>
+      <w:pPr>
         <w:pStyle w:val="Heading2"/>
         <w:spacing w:after="70" w:before="180"/>
       </w:pPr>
@@ -450,6 +470,26 @@
       </w:r>
       <w:r>
         <w:t xml:space="preserve"> — this matters at politically sensitive events, where knowing who you are talking to builds confidence.</w:t>
+      </w:r>
+    </w:p>
+    <w:p>
+      <w:pPr>
+        <w:pStyle w:val="ListParagraph"/>
+        <w:numPr>
+          <w:ilvl w:val="0"/>
+          <w:numId w:val="2"/>
+        </w:numPr>
+        <w:spacing w:after="60"/>
+      </w:pPr>
+      <w:r>
+        <w:rPr>
+          <w:b/>
+          <w:bCs/>
+        </w:rPr>
+        <w:t xml:space="preserve">Profile photos</w:t>
+      </w:r>
+      <w:r>
+        <w:t xml:space="preserve"> — attendees can upload their own photo, so the people you're browsing — and swiping through — feel like real people, not blank profiles.</w:t>
       </w:r>
     </w:p>
     <w:p>

</xml_diff>